<commit_message>
Update EDA notebook with additional analysis and visualizations for vehicle price prediction
</commit_message>
<xml_diff>
--- a/Vance EDA Essay.docx
+++ b/Vance EDA Essay.docx
@@ -41,6 +41,9 @@
     </w:p>
     <w:p>
       <w:r>
+        <w:rPr>
+          <w:noProof/>
+        </w:rPr>
         <w:drawing>
           <wp:inline distT="0" distB="0" distL="0" distR="0" wp14:anchorId="16D77BD0" wp14:editId="56562232">
             <wp:extent cx="5943600" cy="1954530"/>
@@ -96,6 +99,9 @@
         <w:jc w:val="center"/>
       </w:pPr>
       <w:r>
+        <w:rPr>
+          <w:noProof/>
+        </w:rPr>
         <w:drawing>
           <wp:inline distT="0" distB="0" distL="0" distR="0" wp14:anchorId="1AD9BC1E" wp14:editId="23A77091">
             <wp:extent cx="3733800" cy="2882900"/>
@@ -196,15 +202,7 @@
       </w:r>
       <w:r>
         <w:lastRenderedPageBreak/>
-        <w:t xml:space="preserve">highest number of </w:t>
-      </w:r>
-      <w:proofErr w:type="gramStart"/>
-      <w:r>
-        <w:t>rows, and</w:t>
-      </w:r>
-      <w:proofErr w:type="gramEnd"/>
-      <w:r>
-        <w:t xml:space="preserve"> reaffirmed my suspicions that age and mileage played the most significant roles in predicting price.</w:t>
+        <w:t>highest number of rows, and reaffirmed my suspicions that age and mileage played the most significant roles in predicting price.</w:t>
       </w:r>
     </w:p>
     <w:p>
@@ -307,7 +305,10 @@
       <w:pStyle w:val="Header"/>
     </w:pPr>
     <w:r>
-      <w:t>Professor Chase Denton</w:t>
+      <w:t xml:space="preserve">Professor </w:t>
+    </w:r>
+    <w:r>
+      <w:t>Matthew Metzger</w:t>
     </w:r>
   </w:p>
   <w:p>
@@ -315,7 +316,10 @@
       <w:pStyle w:val="Header"/>
     </w:pPr>
     <w:r>
-      <w:t>June 1, 2025</w:t>
+      <w:t>June 1, 202</w:t>
+    </w:r>
+    <w:r>
+      <w:t>5</w:t>
     </w:r>
   </w:p>
   <w:p>

</xml_diff>